<commit_message>
Thumbnails for DOCX, ODT, XLSX and ODS through an optional LibreOffice
A first-page thumbnail for office files, the way a PDF gets one, when
`media.office.command` names a LibreOffice: it converts the file to a
one-page PDF in the job's work directory, one sandboxed process per
document with a private profile, and the page takes the PDF path through
vips. Unset, office files get the icon as before; turning it on later
regenerates them through the variant version. The probe converts a
two-page DOCX and an XLSX and checks the export honours PageRange.

LibreOffice cannot start without a unix socket in /tmp for its
single-instance pipe, so the sandbox gains an opt-in: unix sockets
only, with Landlock letting the child make and remove socket files in
that one directory. Its launcher forks soffice.bin, so a timeout now
kills the child's process group. Closes #4.

Co-Authored-By: Claude Fable 5.1 <noreply@anthropic.com>
</commit_message>
<xml_diff>
--- a/fixtures/image.docx
+++ b/fixtures/image.docx
@@ -7,6 +7,10 @@
         <w:drawing/>
       </w:r>
     </w:p>
+    <w:sectPr>
+      <w:pgSz w:w="11906" w:h="16838"/>
+      <w:pgMar w:top="1440" w:right="1440" w:bottom="1440" w:left="1440" w:header="0" w:footer="0" w:gutter="0"/>
+    </w:sectPr>
   </w:body>
 </w:document>
 </file>
</xml_diff>